<commit_message>
added mois, smth else. SEMESTR PIZDEC
</commit_message>
<xml_diff>
--- a/CHM/чм1.docx
+++ b/CHM/чм1.docx
@@ -7,6 +7,8 @@
         <w:jc w:val="center"/>
         <w:rPr>
           <w:rFonts w:ascii="Times New Roman" w:hAnsi="Times New Roman" w:cs="Times New Roman"/>
+          <w:b/>
+          <w:bCs/>
           <w:sz w:val="32"/>
           <w:szCs w:val="32"/>
         </w:rPr>
@@ -14,6 +16,8 @@
       <w:r>
         <w:rPr>
           <w:rFonts w:ascii="Times New Roman" w:hAnsi="Times New Roman" w:cs="Times New Roman"/>
+          <w:b/>
+          <w:bCs/>
           <w:sz w:val="32"/>
           <w:szCs w:val="32"/>
         </w:rPr>
@@ -25,6 +29,8 @@
         <w:jc w:val="center"/>
         <w:rPr>
           <w:rFonts w:ascii="Times New Roman" w:hAnsi="Times New Roman" w:cs="Times New Roman"/>
+          <w:b/>
+          <w:bCs/>
           <w:sz w:val="32"/>
           <w:szCs w:val="32"/>
         </w:rPr>
@@ -32,6 +38,8 @@
       <w:r>
         <w:rPr>
           <w:rFonts w:ascii="Times New Roman" w:hAnsi="Times New Roman" w:cs="Times New Roman"/>
+          <w:b/>
+          <w:bCs/>
           <w:sz w:val="32"/>
           <w:szCs w:val="32"/>
         </w:rPr>
@@ -164,13 +172,17 @@
         <w:jc w:val="both"/>
         <w:rPr>
           <w:rFonts w:ascii="Times New Roman" w:hAnsi="Times New Roman" w:cs="Times New Roman"/>
-          <w:sz w:val="28"/>
-          <w:szCs w:val="28"/>
-        </w:rPr>
-      </w:pPr>
-      <w:r>
-        <w:rPr>
-          <w:rFonts w:ascii="Times New Roman" w:hAnsi="Times New Roman" w:cs="Times New Roman"/>
+          <w:b/>
+          <w:bCs/>
+          <w:sz w:val="28"/>
+          <w:szCs w:val="28"/>
+        </w:rPr>
+      </w:pPr>
+      <w:r>
+        <w:rPr>
+          <w:rFonts w:ascii="Times New Roman" w:hAnsi="Times New Roman" w:cs="Times New Roman"/>
+          <w:b/>
+          <w:bCs/>
           <w:sz w:val="28"/>
           <w:szCs w:val="28"/>
         </w:rPr>
@@ -190,10 +202,20 @@
       <w:r>
         <w:rPr>
           <w:rFonts w:ascii="Times New Roman" w:hAnsi="Times New Roman" w:cs="Times New Roman"/>
-          <w:sz w:val="28"/>
-          <w:szCs w:val="28"/>
-        </w:rPr>
-        <w:t xml:space="preserve">Цель задания: </w:t>
+          <w:b/>
+          <w:bCs/>
+          <w:sz w:val="28"/>
+          <w:szCs w:val="28"/>
+        </w:rPr>
+        <w:t>Цель задания:</w:t>
+      </w:r>
+      <w:r>
+        <w:rPr>
+          <w:rFonts w:ascii="Times New Roman" w:hAnsi="Times New Roman" w:cs="Times New Roman"/>
+          <w:sz w:val="28"/>
+          <w:szCs w:val="28"/>
+        </w:rPr>
+        <w:t xml:space="preserve"> </w:t>
       </w:r>
       <w:r>
         <w:rPr>
@@ -228,13 +250,17 @@
         <w:jc w:val="both"/>
         <w:rPr>
           <w:rFonts w:ascii="Times New Roman" w:hAnsi="Times New Roman" w:cs="Times New Roman"/>
-          <w:sz w:val="28"/>
-          <w:szCs w:val="28"/>
-        </w:rPr>
-      </w:pPr>
-      <w:r>
-        <w:rPr>
-          <w:rFonts w:ascii="Times New Roman" w:hAnsi="Times New Roman" w:cs="Times New Roman"/>
+          <w:b/>
+          <w:bCs/>
+          <w:sz w:val="28"/>
+          <w:szCs w:val="28"/>
+        </w:rPr>
+      </w:pPr>
+      <w:r>
+        <w:rPr>
+          <w:rFonts w:ascii="Times New Roman" w:hAnsi="Times New Roman" w:cs="Times New Roman"/>
+          <w:b/>
+          <w:bCs/>
           <w:sz w:val="28"/>
           <w:szCs w:val="28"/>
         </w:rPr>
@@ -263,6 +289,57 @@
           <w:szCs w:val="28"/>
         </w:rPr>
         <w:t>Созданы матрицы А и В, заданные условиями</w:t>
+      </w:r>
+      <w:r>
+        <w:rPr>
+          <w:rFonts w:ascii="Times New Roman" w:hAnsi="Times New Roman" w:cs="Times New Roman"/>
+          <w:sz w:val="28"/>
+          <w:szCs w:val="28"/>
+        </w:rPr>
+        <w:t xml:space="preserve"> </w:t>
+      </w:r>
+      <w:r>
+        <w:rPr>
+          <w:rFonts w:ascii="Times New Roman" w:hAnsi="Times New Roman" w:cs="Times New Roman"/>
+          <w:sz w:val="28"/>
+          <w:szCs w:val="28"/>
+        </w:rPr>
+        <w:t>и выведенные в консоль с помощью</w:t>
+      </w:r>
+      <w:r>
+        <w:rPr>
+          <w:rFonts w:ascii="Times New Roman" w:hAnsi="Times New Roman" w:cs="Times New Roman"/>
+          <w:sz w:val="28"/>
+          <w:szCs w:val="28"/>
+        </w:rPr>
+        <w:t xml:space="preserve"> </w:t>
+      </w:r>
+      <w:r>
+        <w:rPr>
+          <w:rFonts w:ascii="Times New Roman" w:hAnsi="Times New Roman" w:cs="Times New Roman"/>
+          <w:sz w:val="28"/>
+          <w:szCs w:val="28"/>
+        </w:rPr>
+        <w:t xml:space="preserve">функции </w:t>
+      </w:r>
+      <w:proofErr w:type="spellStart"/>
+      <w:r>
+        <w:rPr>
+          <w:rFonts w:ascii="Times New Roman" w:hAnsi="Times New Roman" w:cs="Times New Roman"/>
+          <w:sz w:val="28"/>
+          <w:szCs w:val="28"/>
+          <w:lang w:val="en-US"/>
+        </w:rPr>
+        <w:t>MatrixForm</w:t>
+      </w:r>
+      <w:proofErr w:type="spellEnd"/>
+      <w:r>
+        <w:rPr>
+          <w:rFonts w:ascii="Times New Roman" w:hAnsi="Times New Roman" w:cs="Times New Roman"/>
+          <w:sz w:val="28"/>
+          <w:szCs w:val="28"/>
+        </w:rPr>
+        <w:t>:</w:t>
       </w:r>
     </w:p>
     <w:p>
@@ -417,6 +494,7 @@
           <w:sz w:val="28"/>
           <w:szCs w:val="28"/>
         </w:rPr>
+        <w:lastRenderedPageBreak/>
         <w:drawing>
           <wp:inline distT="0" distB="0" distL="0" distR="0" wp14:anchorId="3FB540D5" wp14:editId="04D7D809">
             <wp:extent cx="1699260" cy="1727739"/>
@@ -475,7 +553,6 @@
           <w:sz w:val="28"/>
           <w:szCs w:val="28"/>
         </w:rPr>
-        <w:lastRenderedPageBreak/>
         <w:t xml:space="preserve">Было найдено число обусловленности матрицы </w:t>
       </w:r>
       <w:r>
@@ -492,32 +569,49 @@
           <w:sz w:val="28"/>
           <w:szCs w:val="28"/>
         </w:rPr>
+        <w:t>, используя матрицу, обратную матрице А</w:t>
+      </w:r>
+      <w:r>
+        <w:rPr>
+          <w:rFonts w:ascii="Times New Roman" w:hAnsi="Times New Roman" w:cs="Times New Roman"/>
+          <w:sz w:val="28"/>
+          <w:szCs w:val="28"/>
+        </w:rPr>
+        <w:t xml:space="preserve"> </w:t>
+      </w:r>
+      <w:r>
+        <w:rPr>
+          <w:rFonts w:ascii="Times New Roman" w:hAnsi="Times New Roman" w:cs="Times New Roman"/>
+          <w:sz w:val="28"/>
+          <w:szCs w:val="28"/>
+        </w:rPr>
+        <w:t>и норму матрицы А</w:t>
+      </w:r>
+      <w:r>
+        <w:rPr>
+          <w:rFonts w:ascii="Times New Roman" w:hAnsi="Times New Roman" w:cs="Times New Roman"/>
+          <w:sz w:val="28"/>
+          <w:szCs w:val="28"/>
+        </w:rPr>
         <w:t>:</w:t>
       </w:r>
-    </w:p>
-    <w:p>
-      <w:pPr>
-        <w:pStyle w:val="a3"/>
-        <w:ind w:right="708"/>
-        <w:jc w:val="both"/>
-        <w:rPr>
-          <w:rFonts w:ascii="Times New Roman" w:hAnsi="Times New Roman" w:cs="Times New Roman"/>
-          <w:sz w:val="28"/>
-          <w:szCs w:val="28"/>
-        </w:rPr>
-      </w:pPr>
-      <w:r>
-        <w:rPr>
-          <w:rFonts w:ascii="Times New Roman" w:hAnsi="Times New Roman" w:cs="Times New Roman"/>
+      <w:r>
+        <w:rPr>
           <w:noProof/>
+        </w:rPr>
+        <w:t xml:space="preserve"> </w:t>
+      </w:r>
+      <w:r>
+        <w:rPr>
+          <w:rFonts w:ascii="Times New Roman" w:hAnsi="Times New Roman" w:cs="Times New Roman"/>
           <w:sz w:val="28"/>
           <w:szCs w:val="28"/>
         </w:rPr>
         <w:drawing>
-          <wp:inline distT="0" distB="0" distL="0" distR="0" wp14:anchorId="29ECF8D0" wp14:editId="69757EFA">
-            <wp:extent cx="2217420" cy="1400160"/>
-            <wp:effectExtent l="0" t="0" r="0" b="0"/>
-            <wp:docPr id="4" name="Рисунок 4"/>
+          <wp:inline distT="0" distB="0" distL="0" distR="0" wp14:anchorId="4617A198" wp14:editId="139F0C74">
+            <wp:extent cx="2143424" cy="181000"/>
+            <wp:effectExtent l="0" t="0" r="9525" b="9525"/>
+            <wp:docPr id="26" name="Рисунок 26"/>
             <wp:cNvGraphicFramePr>
               <a:graphicFrameLocks xmlns:a="http://schemas.openxmlformats.org/drawingml/2006/main" noChangeAspect="1"/>
             </wp:cNvGraphicFramePr>
@@ -537,7 +631,7 @@
                   <pic:spPr>
                     <a:xfrm>
                       <a:off x="0" y="0"/>
-                      <a:ext cx="2223545" cy="1404028"/>
+                      <a:ext cx="2143424" cy="181000"/>
                     </a:xfrm>
                     <a:prstGeom prst="rect">
                       <a:avLst/>
@@ -553,103 +647,31 @@
     <w:p>
       <w:pPr>
         <w:pStyle w:val="a3"/>
-        <w:numPr>
-          <w:ilvl w:val="0"/>
-          <w:numId w:val="1"/>
-        </w:numPr>
-        <w:ind w:right="708"/>
-        <w:jc w:val="both"/>
-        <w:rPr>
-          <w:rFonts w:ascii="Times New Roman" w:hAnsi="Times New Roman" w:cs="Times New Roman"/>
-          <w:sz w:val="28"/>
-          <w:szCs w:val="28"/>
-        </w:rPr>
-      </w:pPr>
-      <w:r>
-        <w:rPr>
-          <w:rFonts w:ascii="Times New Roman" w:hAnsi="Times New Roman" w:cs="Times New Roman"/>
-          <w:sz w:val="28"/>
-          <w:szCs w:val="28"/>
-        </w:rPr>
-        <w:t xml:space="preserve">Было найдено решение точной системы </w:t>
-      </w:r>
-      <w:r>
-        <w:rPr>
-          <w:rFonts w:ascii="Times New Roman" w:hAnsi="Times New Roman" w:cs="Times New Roman"/>
-          <w:sz w:val="28"/>
-          <w:szCs w:val="28"/>
-          <w:lang w:val="en-US"/>
-        </w:rPr>
-        <w:t>AX</w:t>
-      </w:r>
-      <w:r>
-        <w:rPr>
-          <w:rFonts w:ascii="Times New Roman" w:hAnsi="Times New Roman" w:cs="Times New Roman"/>
-          <w:sz w:val="28"/>
-          <w:szCs w:val="28"/>
-        </w:rPr>
-        <w:t>=</w:t>
-      </w:r>
-      <w:r>
-        <w:rPr>
-          <w:rFonts w:ascii="Times New Roman" w:hAnsi="Times New Roman" w:cs="Times New Roman"/>
-          <w:sz w:val="28"/>
-          <w:szCs w:val="28"/>
-          <w:lang w:val="en-US"/>
-        </w:rPr>
-        <w:t>B</w:t>
-      </w:r>
-      <w:r>
-        <w:rPr>
-          <w:rFonts w:ascii="Times New Roman" w:hAnsi="Times New Roman" w:cs="Times New Roman"/>
-          <w:sz w:val="28"/>
-          <w:szCs w:val="28"/>
-        </w:rPr>
-        <w:t xml:space="preserve">, используя функцию </w:t>
-      </w:r>
-      <w:proofErr w:type="spellStart"/>
-      <w:r>
-        <w:rPr>
-          <w:rFonts w:ascii="Times New Roman" w:hAnsi="Times New Roman" w:cs="Times New Roman"/>
-          <w:sz w:val="28"/>
-          <w:szCs w:val="28"/>
-          <w:lang w:val="en-US"/>
-        </w:rPr>
-        <w:t>LinearSolve</w:t>
-      </w:r>
-      <w:proofErr w:type="spellEnd"/>
-      <w:r>
-        <w:rPr>
-          <w:rFonts w:ascii="Times New Roman" w:hAnsi="Times New Roman" w:cs="Times New Roman"/>
-          <w:sz w:val="28"/>
-          <w:szCs w:val="28"/>
-        </w:rPr>
-        <w:t>:</w:t>
-      </w:r>
-    </w:p>
-    <w:p>
-      <w:pPr>
-        <w:pStyle w:val="a3"/>
-        <w:ind w:right="708"/>
-        <w:jc w:val="both"/>
-        <w:rPr>
-          <w:rFonts w:ascii="Times New Roman" w:hAnsi="Times New Roman" w:cs="Times New Roman"/>
-          <w:sz w:val="28"/>
-          <w:szCs w:val="28"/>
-        </w:rPr>
-      </w:pPr>
-      <w:r>
-        <w:rPr>
-          <w:rFonts w:ascii="Times New Roman" w:hAnsi="Times New Roman" w:cs="Times New Roman"/>
+        <w:ind w:right="708"/>
+        <w:jc w:val="both"/>
+        <w:rPr>
+          <w:rFonts w:ascii="Times New Roman" w:hAnsi="Times New Roman" w:cs="Times New Roman"/>
+          <w:sz w:val="28"/>
+          <w:szCs w:val="28"/>
+        </w:rPr>
+      </w:pPr>
+      <w:r>
+        <w:rPr>
           <w:noProof/>
+        </w:rPr>
+        <w:t xml:space="preserve"> </w:t>
+      </w:r>
+      <w:r>
+        <w:rPr>
+          <w:rFonts w:ascii="Times New Roman" w:hAnsi="Times New Roman" w:cs="Times New Roman"/>
           <w:sz w:val="28"/>
           <w:szCs w:val="28"/>
         </w:rPr>
         <w:drawing>
-          <wp:inline distT="0" distB="0" distL="0" distR="0" wp14:anchorId="4B2605D0" wp14:editId="34320DED">
-            <wp:extent cx="2225040" cy="2455829"/>
-            <wp:effectExtent l="0" t="0" r="3810" b="1905"/>
-            <wp:docPr id="5" name="Рисунок 5"/>
+          <wp:inline distT="0" distB="0" distL="0" distR="0" wp14:anchorId="1283C325" wp14:editId="63E2262D">
+            <wp:extent cx="1600423" cy="257211"/>
+            <wp:effectExtent l="0" t="0" r="0" b="9525"/>
+            <wp:docPr id="25" name="Рисунок 25"/>
             <wp:cNvGraphicFramePr>
               <a:graphicFrameLocks xmlns:a="http://schemas.openxmlformats.org/drawingml/2006/main" noChangeAspect="1"/>
             </wp:cNvGraphicFramePr>
@@ -669,7 +691,7 @@
                   <pic:spPr>
                     <a:xfrm>
                       <a:off x="0" y="0"/>
-                      <a:ext cx="2231587" cy="2463055"/>
+                      <a:ext cx="1600423" cy="257211"/>
                     </a:xfrm>
                     <a:prstGeom prst="rect">
                       <a:avLst/>
@@ -685,30 +707,6 @@
     <w:p>
       <w:pPr>
         <w:pStyle w:val="a3"/>
-        <w:numPr>
-          <w:ilvl w:val="0"/>
-          <w:numId w:val="1"/>
-        </w:numPr>
-        <w:ind w:right="708"/>
-        <w:jc w:val="both"/>
-        <w:rPr>
-          <w:rFonts w:ascii="Times New Roman" w:hAnsi="Times New Roman" w:cs="Times New Roman"/>
-          <w:sz w:val="28"/>
-          <w:szCs w:val="28"/>
-        </w:rPr>
-      </w:pPr>
-      <w:r>
-        <w:rPr>
-          <w:rFonts w:ascii="Times New Roman" w:hAnsi="Times New Roman" w:cs="Times New Roman"/>
-          <w:sz w:val="28"/>
-          <w:szCs w:val="28"/>
-        </w:rPr>
-        <w:t>Были решены три возмущенные системы при увеличенных значениях последних уравнение системы последовательно на 0.01%, 0.1% и 1%:</w:t>
-      </w:r>
-    </w:p>
-    <w:p>
-      <w:pPr>
-        <w:pStyle w:val="a3"/>
         <w:ind w:right="708"/>
         <w:jc w:val="both"/>
         <w:rPr>
@@ -725,10 +723,10 @@
           <w:szCs w:val="28"/>
         </w:rPr>
         <w:drawing>
-          <wp:inline distT="0" distB="0" distL="0" distR="0" wp14:anchorId="1EE2080B" wp14:editId="2662A654">
-            <wp:extent cx="1282111" cy="1821180"/>
-            <wp:effectExtent l="0" t="0" r="0" b="7620"/>
-            <wp:docPr id="6" name="Рисунок 6"/>
+          <wp:inline distT="0" distB="0" distL="0" distR="0" wp14:anchorId="29ECF8D0" wp14:editId="69757EFA">
+            <wp:extent cx="2217420" cy="1400160"/>
+            <wp:effectExtent l="0" t="0" r="0" b="0"/>
+            <wp:docPr id="4" name="Рисунок 4"/>
             <wp:cNvGraphicFramePr>
               <a:graphicFrameLocks xmlns:a="http://schemas.openxmlformats.org/drawingml/2006/main" noChangeAspect="1"/>
             </wp:cNvGraphicFramePr>
@@ -748,7 +746,7 @@
                   <pic:spPr>
                     <a:xfrm>
                       <a:off x="0" y="0"/>
-                      <a:ext cx="1284814" cy="1825020"/>
+                      <a:ext cx="2223545" cy="1404028"/>
                     </a:xfrm>
                     <a:prstGeom prst="rect">
                       <a:avLst/>
@@ -760,6 +758,95 @@
           </wp:inline>
         </w:drawing>
       </w:r>
+    </w:p>
+    <w:p>
+      <w:pPr>
+        <w:pStyle w:val="a3"/>
+        <w:numPr>
+          <w:ilvl w:val="0"/>
+          <w:numId w:val="1"/>
+        </w:numPr>
+        <w:ind w:right="708"/>
+        <w:jc w:val="both"/>
+        <w:rPr>
+          <w:rFonts w:ascii="Times New Roman" w:hAnsi="Times New Roman" w:cs="Times New Roman"/>
+          <w:sz w:val="28"/>
+          <w:szCs w:val="28"/>
+        </w:rPr>
+      </w:pPr>
+      <w:r>
+        <w:rPr>
+          <w:rFonts w:ascii="Times New Roman" w:hAnsi="Times New Roman" w:cs="Times New Roman"/>
+          <w:sz w:val="28"/>
+          <w:szCs w:val="28"/>
+        </w:rPr>
+        <w:t xml:space="preserve">Было найдено решение точной системы </w:t>
+      </w:r>
+      <w:r>
+        <w:rPr>
+          <w:rFonts w:ascii="Times New Roman" w:hAnsi="Times New Roman" w:cs="Times New Roman"/>
+          <w:sz w:val="28"/>
+          <w:szCs w:val="28"/>
+          <w:lang w:val="en-US"/>
+        </w:rPr>
+        <w:t>AX</w:t>
+      </w:r>
+      <w:r>
+        <w:rPr>
+          <w:rFonts w:ascii="Times New Roman" w:hAnsi="Times New Roman" w:cs="Times New Roman"/>
+          <w:sz w:val="28"/>
+          <w:szCs w:val="28"/>
+        </w:rPr>
+        <w:t>=</w:t>
+      </w:r>
+      <w:r>
+        <w:rPr>
+          <w:rFonts w:ascii="Times New Roman" w:hAnsi="Times New Roman" w:cs="Times New Roman"/>
+          <w:sz w:val="28"/>
+          <w:szCs w:val="28"/>
+          <w:lang w:val="en-US"/>
+        </w:rPr>
+        <w:t>B</w:t>
+      </w:r>
+      <w:r>
+        <w:rPr>
+          <w:rFonts w:ascii="Times New Roman" w:hAnsi="Times New Roman" w:cs="Times New Roman"/>
+          <w:sz w:val="28"/>
+          <w:szCs w:val="28"/>
+        </w:rPr>
+        <w:t xml:space="preserve">, используя функцию </w:t>
+      </w:r>
+      <w:proofErr w:type="spellStart"/>
+      <w:r>
+        <w:rPr>
+          <w:rFonts w:ascii="Times New Roman" w:hAnsi="Times New Roman" w:cs="Times New Roman"/>
+          <w:sz w:val="28"/>
+          <w:szCs w:val="28"/>
+          <w:lang w:val="en-US"/>
+        </w:rPr>
+        <w:t>LinearSolve</w:t>
+      </w:r>
+      <w:proofErr w:type="spellEnd"/>
+      <w:r>
+        <w:rPr>
+          <w:rFonts w:ascii="Times New Roman" w:hAnsi="Times New Roman" w:cs="Times New Roman"/>
+          <w:sz w:val="28"/>
+          <w:szCs w:val="28"/>
+        </w:rPr>
+        <w:t>:</w:t>
+      </w:r>
+    </w:p>
+    <w:p>
+      <w:pPr>
+        <w:pStyle w:val="a3"/>
+        <w:ind w:right="708"/>
+        <w:jc w:val="both"/>
+        <w:rPr>
+          <w:rFonts w:ascii="Times New Roman" w:hAnsi="Times New Roman" w:cs="Times New Roman"/>
+          <w:sz w:val="28"/>
+          <w:szCs w:val="28"/>
+        </w:rPr>
+      </w:pPr>
       <w:r>
         <w:rPr>
           <w:rFonts w:ascii="Times New Roman" w:hAnsi="Times New Roman" w:cs="Times New Roman"/>
@@ -768,10 +855,10 @@
           <w:szCs w:val="28"/>
         </w:rPr>
         <w:drawing>
-          <wp:inline distT="0" distB="0" distL="0" distR="0" wp14:anchorId="6AA2460F" wp14:editId="754ACA60">
-            <wp:extent cx="1341120" cy="1817001"/>
-            <wp:effectExtent l="0" t="0" r="0" b="0"/>
-            <wp:docPr id="7" name="Рисунок 7"/>
+          <wp:inline distT="0" distB="0" distL="0" distR="0" wp14:anchorId="4B2605D0" wp14:editId="34320DED">
+            <wp:extent cx="2225040" cy="2455829"/>
+            <wp:effectExtent l="0" t="0" r="3810" b="1905"/>
+            <wp:docPr id="5" name="Рисунок 5"/>
             <wp:cNvGraphicFramePr>
               <a:graphicFrameLocks xmlns:a="http://schemas.openxmlformats.org/drawingml/2006/main" noChangeAspect="1"/>
             </wp:cNvGraphicFramePr>
@@ -791,7 +878,7 @@
                   <pic:spPr>
                     <a:xfrm>
                       <a:off x="0" y="0"/>
-                      <a:ext cx="1348986" cy="1827659"/>
+                      <a:ext cx="2231587" cy="2463055"/>
                     </a:xfrm>
                     <a:prstGeom prst="rect">
                       <a:avLst/>
@@ -803,6 +890,42 @@
           </wp:inline>
         </w:drawing>
       </w:r>
+    </w:p>
+    <w:p>
+      <w:pPr>
+        <w:pStyle w:val="a3"/>
+        <w:numPr>
+          <w:ilvl w:val="0"/>
+          <w:numId w:val="1"/>
+        </w:numPr>
+        <w:ind w:right="708"/>
+        <w:jc w:val="both"/>
+        <w:rPr>
+          <w:rFonts w:ascii="Times New Roman" w:hAnsi="Times New Roman" w:cs="Times New Roman"/>
+          <w:sz w:val="28"/>
+          <w:szCs w:val="28"/>
+        </w:rPr>
+      </w:pPr>
+      <w:r>
+        <w:rPr>
+          <w:rFonts w:ascii="Times New Roman" w:hAnsi="Times New Roman" w:cs="Times New Roman"/>
+          <w:sz w:val="28"/>
+          <w:szCs w:val="28"/>
+        </w:rPr>
+        <w:t>Были решены три возмущенные системы при увеличенных значениях последних уравнение системы последовательно на 0.01%, 0.1% и 1%:</w:t>
+      </w:r>
+    </w:p>
+    <w:p>
+      <w:pPr>
+        <w:pStyle w:val="a3"/>
+        <w:ind w:right="708"/>
+        <w:jc w:val="both"/>
+        <w:rPr>
+          <w:rFonts w:ascii="Times New Roman" w:hAnsi="Times New Roman" w:cs="Times New Roman"/>
+          <w:sz w:val="28"/>
+          <w:szCs w:val="28"/>
+        </w:rPr>
+      </w:pPr>
       <w:r>
         <w:rPr>
           <w:rFonts w:ascii="Times New Roman" w:hAnsi="Times New Roman" w:cs="Times New Roman"/>
@@ -810,11 +933,12 @@
           <w:sz w:val="28"/>
           <w:szCs w:val="28"/>
         </w:rPr>
+        <w:lastRenderedPageBreak/>
         <w:drawing>
-          <wp:inline distT="0" distB="0" distL="0" distR="0" wp14:anchorId="5195D4FF" wp14:editId="5BBE6087">
-            <wp:extent cx="1408471" cy="1828800"/>
-            <wp:effectExtent l="0" t="0" r="1270" b="0"/>
-            <wp:docPr id="8" name="Рисунок 8"/>
+          <wp:inline distT="0" distB="0" distL="0" distR="0" wp14:anchorId="1EE2080B" wp14:editId="2662A654">
+            <wp:extent cx="1282111" cy="1821180"/>
+            <wp:effectExtent l="0" t="0" r="0" b="7620"/>
+            <wp:docPr id="6" name="Рисунок 6"/>
             <wp:cNvGraphicFramePr>
               <a:graphicFrameLocks xmlns:a="http://schemas.openxmlformats.org/drawingml/2006/main" noChangeAspect="1"/>
             </wp:cNvGraphicFramePr>
@@ -834,7 +958,7 @@
                   <pic:spPr>
                     <a:xfrm>
                       <a:off x="0" y="0"/>
-                      <a:ext cx="1418388" cy="1841677"/>
+                      <a:ext cx="1284814" cy="1825020"/>
                     </a:xfrm>
                     <a:prstGeom prst="rect">
                       <a:avLst/>
@@ -846,42 +970,6 @@
           </wp:inline>
         </w:drawing>
       </w:r>
-    </w:p>
-    <w:p>
-      <w:pPr>
-        <w:pStyle w:val="a3"/>
-        <w:numPr>
-          <w:ilvl w:val="0"/>
-          <w:numId w:val="1"/>
-        </w:numPr>
-        <w:ind w:right="708"/>
-        <w:jc w:val="both"/>
-        <w:rPr>
-          <w:rFonts w:ascii="Times New Roman" w:hAnsi="Times New Roman" w:cs="Times New Roman"/>
-          <w:sz w:val="28"/>
-          <w:szCs w:val="28"/>
-        </w:rPr>
-      </w:pPr>
-      <w:r>
-        <w:rPr>
-          <w:rFonts w:ascii="Times New Roman" w:hAnsi="Times New Roman" w:cs="Times New Roman"/>
-          <w:sz w:val="28"/>
-          <w:szCs w:val="28"/>
-        </w:rPr>
-        <w:t>Были найдены предельные относительные погрешности решения трех систем:</w:t>
-      </w:r>
-    </w:p>
-    <w:p>
-      <w:pPr>
-        <w:pStyle w:val="a3"/>
-        <w:ind w:right="708"/>
-        <w:jc w:val="both"/>
-        <w:rPr>
-          <w:rFonts w:ascii="Times New Roman" w:hAnsi="Times New Roman" w:cs="Times New Roman"/>
-          <w:sz w:val="28"/>
-          <w:szCs w:val="28"/>
-        </w:rPr>
-      </w:pPr>
       <w:r>
         <w:rPr>
           <w:rFonts w:ascii="Times New Roman" w:hAnsi="Times New Roman" w:cs="Times New Roman"/>
@@ -889,12 +977,11 @@
           <w:sz w:val="28"/>
           <w:szCs w:val="28"/>
         </w:rPr>
-        <w:lastRenderedPageBreak/>
         <w:drawing>
-          <wp:inline distT="0" distB="0" distL="0" distR="0" wp14:anchorId="10027F72" wp14:editId="45C1518A">
-            <wp:extent cx="3634740" cy="3876479"/>
-            <wp:effectExtent l="0" t="0" r="3810" b="0"/>
-            <wp:docPr id="9" name="Рисунок 9"/>
+          <wp:inline distT="0" distB="0" distL="0" distR="0" wp14:anchorId="6AA2460F" wp14:editId="754ACA60">
+            <wp:extent cx="1341120" cy="1817001"/>
+            <wp:effectExtent l="0" t="0" r="0" b="0"/>
+            <wp:docPr id="7" name="Рисунок 7"/>
             <wp:cNvGraphicFramePr>
               <a:graphicFrameLocks xmlns:a="http://schemas.openxmlformats.org/drawingml/2006/main" noChangeAspect="1"/>
             </wp:cNvGraphicFramePr>
@@ -914,7 +1001,7 @@
                   <pic:spPr>
                     <a:xfrm>
                       <a:off x="0" y="0"/>
-                      <a:ext cx="3642409" cy="3884658"/>
+                      <a:ext cx="1348986" cy="1827659"/>
                     </a:xfrm>
                     <a:prstGeom prst="rect">
                       <a:avLst/>
@@ -926,61 +1013,6 @@
           </wp:inline>
         </w:drawing>
       </w:r>
-    </w:p>
-    <w:p>
-      <w:pPr>
-        <w:ind w:right="708"/>
-        <w:jc w:val="both"/>
-        <w:rPr>
-          <w:rFonts w:ascii="Times New Roman" w:hAnsi="Times New Roman" w:cs="Times New Roman"/>
-          <w:sz w:val="28"/>
-          <w:szCs w:val="28"/>
-        </w:rPr>
-      </w:pPr>
-      <w:r>
-        <w:rPr>
-          <w:rFonts w:ascii="Times New Roman" w:hAnsi="Times New Roman" w:cs="Times New Roman"/>
-          <w:sz w:val="28"/>
-          <w:szCs w:val="28"/>
-        </w:rPr>
-        <w:t>Задание 1.2:</w:t>
-      </w:r>
-    </w:p>
-    <w:p>
-      <w:pPr>
-        <w:pStyle w:val="a3"/>
-        <w:numPr>
-          <w:ilvl w:val="0"/>
-          <w:numId w:val="2"/>
-        </w:numPr>
-        <w:ind w:right="708"/>
-        <w:jc w:val="both"/>
-        <w:rPr>
-          <w:rFonts w:ascii="Times New Roman" w:hAnsi="Times New Roman" w:cs="Times New Roman"/>
-          <w:sz w:val="28"/>
-          <w:szCs w:val="28"/>
-        </w:rPr>
-      </w:pPr>
-      <w:r>
-        <w:rPr>
-          <w:rFonts w:ascii="Times New Roman" w:hAnsi="Times New Roman" w:cs="Times New Roman"/>
-          <w:sz w:val="28"/>
-          <w:szCs w:val="28"/>
-        </w:rPr>
-        <w:t>Были созданы матрицы, заданные условиями:</w:t>
-      </w:r>
-    </w:p>
-    <w:p>
-      <w:pPr>
-        <w:pStyle w:val="a3"/>
-        <w:ind w:right="708"/>
-        <w:jc w:val="both"/>
-        <w:rPr>
-          <w:rFonts w:ascii="Times New Roman" w:hAnsi="Times New Roman" w:cs="Times New Roman"/>
-          <w:sz w:val="28"/>
-          <w:szCs w:val="28"/>
-        </w:rPr>
-      </w:pPr>
       <w:r>
         <w:rPr>
           <w:rFonts w:ascii="Times New Roman" w:hAnsi="Times New Roman" w:cs="Times New Roman"/>
@@ -989,10 +1021,10 @@
           <w:szCs w:val="28"/>
         </w:rPr>
         <w:drawing>
-          <wp:inline distT="0" distB="0" distL="0" distR="0" wp14:anchorId="04A08AC4" wp14:editId="7C44EF27">
-            <wp:extent cx="2875852" cy="883920"/>
+          <wp:inline distT="0" distB="0" distL="0" distR="0" wp14:anchorId="5195D4FF" wp14:editId="5BBE6087">
+            <wp:extent cx="1408471" cy="1828800"/>
             <wp:effectExtent l="0" t="0" r="1270" b="0"/>
-            <wp:docPr id="10" name="Рисунок 10"/>
+            <wp:docPr id="8" name="Рисунок 8"/>
             <wp:cNvGraphicFramePr>
               <a:graphicFrameLocks xmlns:a="http://schemas.openxmlformats.org/drawingml/2006/main" noChangeAspect="1"/>
             </wp:cNvGraphicFramePr>
@@ -1012,7 +1044,7 @@
                   <pic:spPr>
                     <a:xfrm>
                       <a:off x="0" y="0"/>
-                      <a:ext cx="2887702" cy="887562"/>
+                      <a:ext cx="1418388" cy="1841677"/>
                     </a:xfrm>
                     <a:prstGeom prst="rect">
                       <a:avLst/>
@@ -1028,6 +1060,30 @@
     <w:p>
       <w:pPr>
         <w:pStyle w:val="a3"/>
+        <w:numPr>
+          <w:ilvl w:val="0"/>
+          <w:numId w:val="1"/>
+        </w:numPr>
+        <w:ind w:right="708"/>
+        <w:jc w:val="both"/>
+        <w:rPr>
+          <w:rFonts w:ascii="Times New Roman" w:hAnsi="Times New Roman" w:cs="Times New Roman"/>
+          <w:sz w:val="28"/>
+          <w:szCs w:val="28"/>
+        </w:rPr>
+      </w:pPr>
+      <w:r>
+        <w:rPr>
+          <w:rFonts w:ascii="Times New Roman" w:hAnsi="Times New Roman" w:cs="Times New Roman"/>
+          <w:sz w:val="28"/>
+          <w:szCs w:val="28"/>
+        </w:rPr>
+        <w:t>Были найдены предельные относительные погрешности решения трех систем:</w:t>
+      </w:r>
+    </w:p>
+    <w:p>
+      <w:pPr>
+        <w:pStyle w:val="a3"/>
         <w:ind w:right="708"/>
         <w:jc w:val="both"/>
         <w:rPr>
@@ -1044,10 +1100,10 @@
           <w:szCs w:val="28"/>
         </w:rPr>
         <w:drawing>
-          <wp:inline distT="0" distB="0" distL="0" distR="0" wp14:anchorId="213377CC" wp14:editId="51CD1D95">
-            <wp:extent cx="2878890" cy="1851660"/>
-            <wp:effectExtent l="0" t="0" r="0" b="0"/>
-            <wp:docPr id="11" name="Рисунок 11"/>
+          <wp:inline distT="0" distB="0" distL="0" distR="0" wp14:anchorId="10027F72" wp14:editId="45C1518A">
+            <wp:extent cx="3634740" cy="3876479"/>
+            <wp:effectExtent l="0" t="0" r="3810" b="0"/>
+            <wp:docPr id="9" name="Рисунок 9"/>
             <wp:cNvGraphicFramePr>
               <a:graphicFrameLocks xmlns:a="http://schemas.openxmlformats.org/drawingml/2006/main" noChangeAspect="1"/>
             </wp:cNvGraphicFramePr>
@@ -1067,7 +1123,7 @@
                   <pic:spPr>
                     <a:xfrm>
                       <a:off x="0" y="0"/>
-                      <a:ext cx="2886868" cy="1856791"/>
+                      <a:ext cx="3642409" cy="3884658"/>
                     </a:xfrm>
                     <a:prstGeom prst="rect">
                       <a:avLst/>
@@ -1079,6 +1135,65 @@
           </wp:inline>
         </w:drawing>
       </w:r>
+    </w:p>
+    <w:p>
+      <w:pPr>
+        <w:ind w:right="708"/>
+        <w:jc w:val="both"/>
+        <w:rPr>
+          <w:rFonts w:ascii="Times New Roman" w:hAnsi="Times New Roman" w:cs="Times New Roman"/>
+          <w:b/>
+          <w:bCs/>
+          <w:sz w:val="28"/>
+          <w:szCs w:val="28"/>
+        </w:rPr>
+      </w:pPr>
+      <w:r>
+        <w:rPr>
+          <w:rFonts w:ascii="Times New Roman" w:hAnsi="Times New Roman" w:cs="Times New Roman"/>
+          <w:b/>
+          <w:bCs/>
+          <w:sz w:val="28"/>
+          <w:szCs w:val="28"/>
+        </w:rPr>
+        <w:t>Задание 1.2:</w:t>
+      </w:r>
+    </w:p>
+    <w:p>
+      <w:pPr>
+        <w:pStyle w:val="a3"/>
+        <w:numPr>
+          <w:ilvl w:val="0"/>
+          <w:numId w:val="2"/>
+        </w:numPr>
+        <w:ind w:right="708"/>
+        <w:jc w:val="both"/>
+        <w:rPr>
+          <w:rFonts w:ascii="Times New Roman" w:hAnsi="Times New Roman" w:cs="Times New Roman"/>
+          <w:sz w:val="28"/>
+          <w:szCs w:val="28"/>
+        </w:rPr>
+      </w:pPr>
+      <w:r>
+        <w:rPr>
+          <w:rFonts w:ascii="Times New Roman" w:hAnsi="Times New Roman" w:cs="Times New Roman"/>
+          <w:sz w:val="28"/>
+          <w:szCs w:val="28"/>
+        </w:rPr>
+        <w:t>Были созданы матрицы, заданные условиями:</w:t>
+      </w:r>
+    </w:p>
+    <w:p>
+      <w:pPr>
+        <w:pStyle w:val="a3"/>
+        <w:ind w:right="708"/>
+        <w:jc w:val="both"/>
+        <w:rPr>
+          <w:rFonts w:ascii="Times New Roman" w:hAnsi="Times New Roman" w:cs="Times New Roman"/>
+          <w:sz w:val="28"/>
+          <w:szCs w:val="28"/>
+        </w:rPr>
+      </w:pPr>
       <w:r>
         <w:rPr>
           <w:rFonts w:ascii="Times New Roman" w:hAnsi="Times New Roman" w:cs="Times New Roman"/>
@@ -1087,10 +1202,10 @@
           <w:szCs w:val="28"/>
         </w:rPr>
         <w:drawing>
-          <wp:inline distT="0" distB="0" distL="0" distR="0" wp14:anchorId="792652D0" wp14:editId="4BFF43FB">
-            <wp:extent cx="1805940" cy="2094067"/>
-            <wp:effectExtent l="0" t="0" r="3810" b="1905"/>
-            <wp:docPr id="12" name="Рисунок 12"/>
+          <wp:inline distT="0" distB="0" distL="0" distR="0" wp14:anchorId="04A08AC4" wp14:editId="7C44EF27">
+            <wp:extent cx="2875852" cy="883920"/>
+            <wp:effectExtent l="0" t="0" r="1270" b="0"/>
+            <wp:docPr id="10" name="Рисунок 10"/>
             <wp:cNvGraphicFramePr>
               <a:graphicFrameLocks xmlns:a="http://schemas.openxmlformats.org/drawingml/2006/main" noChangeAspect="1"/>
             </wp:cNvGraphicFramePr>
@@ -1110,7 +1225,7 @@
                   <pic:spPr>
                     <a:xfrm>
                       <a:off x="0" y="0"/>
-                      <a:ext cx="1808570" cy="2097117"/>
+                      <a:ext cx="2887702" cy="887562"/>
                     </a:xfrm>
                     <a:prstGeom prst="rect">
                       <a:avLst/>
@@ -1126,26 +1241,14 @@
     <w:p>
       <w:pPr>
         <w:pStyle w:val="a3"/>
-        <w:numPr>
-          <w:ilvl w:val="0"/>
-          <w:numId w:val="2"/>
-        </w:numPr>
-        <w:ind w:right="708"/>
-        <w:jc w:val="both"/>
-        <w:rPr>
-          <w:rFonts w:ascii="Times New Roman" w:hAnsi="Times New Roman" w:cs="Times New Roman"/>
-          <w:sz w:val="28"/>
-          <w:szCs w:val="28"/>
-        </w:rPr>
-      </w:pPr>
-      <w:r>
-        <w:rPr>
-          <w:rFonts w:ascii="Times New Roman" w:hAnsi="Times New Roman" w:cs="Times New Roman"/>
-          <w:sz w:val="28"/>
-          <w:szCs w:val="28"/>
-        </w:rPr>
-        <w:t>Было найдено число обусловленности матрицы А:</w:t>
-      </w:r>
+        <w:ind w:right="708"/>
+        <w:jc w:val="both"/>
+        <w:rPr>
+          <w:rFonts w:ascii="Times New Roman" w:hAnsi="Times New Roman" w:cs="Times New Roman"/>
+          <w:sz w:val="28"/>
+          <w:szCs w:val="28"/>
+        </w:rPr>
+      </w:pPr>
     </w:p>
     <w:p>
       <w:pPr>
@@ -1165,11 +1268,12 @@
           <w:sz w:val="28"/>
           <w:szCs w:val="28"/>
         </w:rPr>
+        <w:lastRenderedPageBreak/>
         <w:drawing>
-          <wp:inline distT="0" distB="0" distL="0" distR="0" wp14:anchorId="18E7B3DC" wp14:editId="25B46DFD">
-            <wp:extent cx="2004060" cy="1024675"/>
-            <wp:effectExtent l="0" t="0" r="0" b="4445"/>
-            <wp:docPr id="13" name="Рисунок 13"/>
+          <wp:inline distT="0" distB="0" distL="0" distR="0" wp14:anchorId="213377CC" wp14:editId="51CD1D95">
+            <wp:extent cx="2878890" cy="1851660"/>
+            <wp:effectExtent l="0" t="0" r="0" b="0"/>
+            <wp:docPr id="11" name="Рисунок 11"/>
             <wp:cNvGraphicFramePr>
               <a:graphicFrameLocks xmlns:a="http://schemas.openxmlformats.org/drawingml/2006/main" noChangeAspect="1"/>
             </wp:cNvGraphicFramePr>
@@ -1189,7 +1293,7 @@
                   <pic:spPr>
                     <a:xfrm>
                       <a:off x="0" y="0"/>
-                      <a:ext cx="2008063" cy="1026722"/>
+                      <a:ext cx="2886868" cy="1856791"/>
                     </a:xfrm>
                     <a:prstGeom prst="rect">
                       <a:avLst/>
@@ -1209,10 +1313,10 @@
           <w:szCs w:val="28"/>
         </w:rPr>
         <w:drawing>
-          <wp:inline distT="0" distB="0" distL="0" distR="0" wp14:anchorId="1E7FEB01" wp14:editId="5B3ADF82">
-            <wp:extent cx="1706880" cy="619432"/>
-            <wp:effectExtent l="0" t="0" r="7620" b="9525"/>
-            <wp:docPr id="14" name="Рисунок 14"/>
+          <wp:inline distT="0" distB="0" distL="0" distR="0" wp14:anchorId="792652D0" wp14:editId="4BFF43FB">
+            <wp:extent cx="1805940" cy="2094067"/>
+            <wp:effectExtent l="0" t="0" r="3810" b="1905"/>
+            <wp:docPr id="12" name="Рисунок 12"/>
             <wp:cNvGraphicFramePr>
               <a:graphicFrameLocks xmlns:a="http://schemas.openxmlformats.org/drawingml/2006/main" noChangeAspect="1"/>
             </wp:cNvGraphicFramePr>
@@ -1232,7 +1336,7 @@
                   <pic:spPr>
                     <a:xfrm>
                       <a:off x="0" y="0"/>
-                      <a:ext cx="1725021" cy="626015"/>
+                      <a:ext cx="1808570" cy="2097117"/>
                     </a:xfrm>
                     <a:prstGeom prst="rect">
                       <a:avLst/>
@@ -1266,53 +1370,48 @@
           <w:sz w:val="28"/>
           <w:szCs w:val="28"/>
         </w:rPr>
-        <w:t xml:space="preserve">Было найдено решение точной системы </w:t>
-      </w:r>
-      <w:r>
-        <w:rPr>
-          <w:rFonts w:ascii="Times New Roman" w:hAnsi="Times New Roman" w:cs="Times New Roman"/>
-          <w:sz w:val="28"/>
-          <w:szCs w:val="28"/>
-          <w:lang w:val="en-US"/>
-        </w:rPr>
-        <w:t>AX</w:t>
-      </w:r>
-      <w:r>
-        <w:rPr>
-          <w:rFonts w:ascii="Times New Roman" w:hAnsi="Times New Roman" w:cs="Times New Roman"/>
-          <w:sz w:val="28"/>
-          <w:szCs w:val="28"/>
-        </w:rPr>
-        <w:t>=</w:t>
-      </w:r>
-      <w:r>
-        <w:rPr>
-          <w:rFonts w:ascii="Times New Roman" w:hAnsi="Times New Roman" w:cs="Times New Roman"/>
-          <w:sz w:val="28"/>
-          <w:szCs w:val="28"/>
-          <w:lang w:val="en-US"/>
-        </w:rPr>
-        <w:t>B</w:t>
-      </w:r>
-      <w:r>
-        <w:rPr>
-          <w:rFonts w:ascii="Times New Roman" w:hAnsi="Times New Roman" w:cs="Times New Roman"/>
-          <w:sz w:val="28"/>
-          <w:szCs w:val="28"/>
-        </w:rPr>
-        <w:t xml:space="preserve">, используя функцию </w:t>
-      </w:r>
-      <w:proofErr w:type="spellStart"/>
-      <w:r>
-        <w:rPr>
-          <w:rFonts w:ascii="Times New Roman" w:hAnsi="Times New Roman" w:cs="Times New Roman"/>
-          <w:sz w:val="28"/>
-          <w:szCs w:val="28"/>
-          <w:lang w:val="en-US"/>
-        </w:rPr>
-        <w:t>LinearSolve</w:t>
-      </w:r>
-      <w:proofErr w:type="spellEnd"/>
+        <w:t>Было найдено число обусловленности матрицы А</w:t>
+      </w:r>
+      <w:r>
+        <w:rPr>
+          <w:rFonts w:ascii="Times New Roman" w:hAnsi="Times New Roman" w:cs="Times New Roman"/>
+          <w:sz w:val="28"/>
+          <w:szCs w:val="28"/>
+        </w:rPr>
+        <w:t xml:space="preserve">, </w:t>
+      </w:r>
+      <w:r>
+        <w:rPr>
+          <w:rFonts w:ascii="Times New Roman" w:hAnsi="Times New Roman" w:cs="Times New Roman"/>
+          <w:sz w:val="28"/>
+          <w:szCs w:val="28"/>
+        </w:rPr>
+        <w:t>используя матрицу, обратную матрице А</w:t>
+      </w:r>
+      <w:r>
+        <w:rPr>
+          <w:rFonts w:ascii="Times New Roman" w:hAnsi="Times New Roman" w:cs="Times New Roman"/>
+          <w:sz w:val="28"/>
+          <w:szCs w:val="28"/>
+        </w:rPr>
+        <w:t>,</w:t>
+      </w:r>
+      <w:r>
+        <w:rPr>
+          <w:rFonts w:ascii="Times New Roman" w:hAnsi="Times New Roman" w:cs="Times New Roman"/>
+          <w:sz w:val="28"/>
+          <w:szCs w:val="28"/>
+        </w:rPr>
+        <w:t xml:space="preserve"> </w:t>
+      </w:r>
+      <w:r>
+        <w:rPr>
+          <w:rFonts w:ascii="Times New Roman" w:hAnsi="Times New Roman" w:cs="Times New Roman"/>
+          <w:sz w:val="28"/>
+          <w:szCs w:val="28"/>
+        </w:rPr>
+        <w:t>и норму матрицы А</w:t>
+      </w:r>
       <w:r>
         <w:rPr>
           <w:rFonts w:ascii="Times New Roman" w:hAnsi="Times New Roman" w:cs="Times New Roman"/>
@@ -1340,12 +1439,11 @@
           <w:sz w:val="28"/>
           <w:szCs w:val="28"/>
         </w:rPr>
-        <w:lastRenderedPageBreak/>
         <w:drawing>
-          <wp:inline distT="0" distB="0" distL="0" distR="0" wp14:anchorId="2D9A80A8" wp14:editId="20D35371">
-            <wp:extent cx="3444356" cy="1653540"/>
-            <wp:effectExtent l="0" t="0" r="3810" b="3810"/>
-            <wp:docPr id="15" name="Рисунок 15"/>
+          <wp:inline distT="0" distB="0" distL="0" distR="0" wp14:anchorId="18E7B3DC" wp14:editId="25B46DFD">
+            <wp:extent cx="2004060" cy="1024675"/>
+            <wp:effectExtent l="0" t="0" r="0" b="4445"/>
+            <wp:docPr id="13" name="Рисунок 13"/>
             <wp:cNvGraphicFramePr>
               <a:graphicFrameLocks xmlns:a="http://schemas.openxmlformats.org/drawingml/2006/main" noChangeAspect="1"/>
             </wp:cNvGraphicFramePr>
@@ -1365,7 +1463,7 @@
                   <pic:spPr>
                     <a:xfrm>
                       <a:off x="0" y="0"/>
-                      <a:ext cx="3454513" cy="1658416"/>
+                      <a:ext cx="2008063" cy="1026722"/>
                     </a:xfrm>
                     <a:prstGeom prst="rect">
                       <a:avLst/>
@@ -1377,42 +1475,6 @@
           </wp:inline>
         </w:drawing>
       </w:r>
-    </w:p>
-    <w:p>
-      <w:pPr>
-        <w:pStyle w:val="a3"/>
-        <w:numPr>
-          <w:ilvl w:val="0"/>
-          <w:numId w:val="2"/>
-        </w:numPr>
-        <w:ind w:right="708"/>
-        <w:jc w:val="both"/>
-        <w:rPr>
-          <w:rFonts w:ascii="Times New Roman" w:hAnsi="Times New Roman" w:cs="Times New Roman"/>
-          <w:sz w:val="28"/>
-          <w:szCs w:val="28"/>
-        </w:rPr>
-      </w:pPr>
-      <w:r>
-        <w:rPr>
-          <w:rFonts w:ascii="Times New Roman" w:hAnsi="Times New Roman" w:cs="Times New Roman"/>
-          <w:sz w:val="28"/>
-          <w:szCs w:val="28"/>
-        </w:rPr>
-        <w:t>Были решены три возмущенные системы при увеличенных значениях последних уравнение системы последовательно на 0.01%, 0.1% и 1%:</w:t>
-      </w:r>
-    </w:p>
-    <w:p>
-      <w:pPr>
-        <w:pStyle w:val="a3"/>
-        <w:ind w:right="708"/>
-        <w:jc w:val="both"/>
-        <w:rPr>
-          <w:rFonts w:ascii="Times New Roman" w:hAnsi="Times New Roman" w:cs="Times New Roman"/>
-          <w:sz w:val="28"/>
-          <w:szCs w:val="28"/>
-        </w:rPr>
-      </w:pPr>
       <w:r>
         <w:rPr>
           <w:rFonts w:ascii="Times New Roman" w:hAnsi="Times New Roman" w:cs="Times New Roman"/>
@@ -1421,10 +1483,10 @@
           <w:szCs w:val="28"/>
         </w:rPr>
         <w:drawing>
-          <wp:inline distT="0" distB="0" distL="0" distR="0" wp14:anchorId="1C1FEE72" wp14:editId="02C0E3D1">
-            <wp:extent cx="3171139" cy="1844040"/>
-            <wp:effectExtent l="0" t="0" r="0" b="3810"/>
-            <wp:docPr id="17" name="Рисунок 17"/>
+          <wp:inline distT="0" distB="0" distL="0" distR="0" wp14:anchorId="1E7FEB01" wp14:editId="5B3ADF82">
+            <wp:extent cx="1706880" cy="619432"/>
+            <wp:effectExtent l="0" t="0" r="7620" b="9525"/>
+            <wp:docPr id="14" name="Рисунок 14"/>
             <wp:cNvGraphicFramePr>
               <a:graphicFrameLocks xmlns:a="http://schemas.openxmlformats.org/drawingml/2006/main" noChangeAspect="1"/>
             </wp:cNvGraphicFramePr>
@@ -1444,7 +1506,7 @@
                   <pic:spPr>
                     <a:xfrm>
                       <a:off x="0" y="0"/>
-                      <a:ext cx="3182619" cy="1850716"/>
+                      <a:ext cx="1725021" cy="626015"/>
                     </a:xfrm>
                     <a:prstGeom prst="rect">
                       <a:avLst/>
@@ -1456,6 +1518,95 @@
           </wp:inline>
         </w:drawing>
       </w:r>
+    </w:p>
+    <w:p>
+      <w:pPr>
+        <w:pStyle w:val="a3"/>
+        <w:numPr>
+          <w:ilvl w:val="0"/>
+          <w:numId w:val="2"/>
+        </w:numPr>
+        <w:ind w:right="708"/>
+        <w:jc w:val="both"/>
+        <w:rPr>
+          <w:rFonts w:ascii="Times New Roman" w:hAnsi="Times New Roman" w:cs="Times New Roman"/>
+          <w:sz w:val="28"/>
+          <w:szCs w:val="28"/>
+        </w:rPr>
+      </w:pPr>
+      <w:r>
+        <w:rPr>
+          <w:rFonts w:ascii="Times New Roman" w:hAnsi="Times New Roman" w:cs="Times New Roman"/>
+          <w:sz w:val="28"/>
+          <w:szCs w:val="28"/>
+        </w:rPr>
+        <w:t xml:space="preserve">Было найдено решение точной системы </w:t>
+      </w:r>
+      <w:r>
+        <w:rPr>
+          <w:rFonts w:ascii="Times New Roman" w:hAnsi="Times New Roman" w:cs="Times New Roman"/>
+          <w:sz w:val="28"/>
+          <w:szCs w:val="28"/>
+          <w:lang w:val="en-US"/>
+        </w:rPr>
+        <w:t>AX</w:t>
+      </w:r>
+      <w:r>
+        <w:rPr>
+          <w:rFonts w:ascii="Times New Roman" w:hAnsi="Times New Roman" w:cs="Times New Roman"/>
+          <w:sz w:val="28"/>
+          <w:szCs w:val="28"/>
+        </w:rPr>
+        <w:t>=</w:t>
+      </w:r>
+      <w:r>
+        <w:rPr>
+          <w:rFonts w:ascii="Times New Roman" w:hAnsi="Times New Roman" w:cs="Times New Roman"/>
+          <w:sz w:val="28"/>
+          <w:szCs w:val="28"/>
+          <w:lang w:val="en-US"/>
+        </w:rPr>
+        <w:t>B</w:t>
+      </w:r>
+      <w:r>
+        <w:rPr>
+          <w:rFonts w:ascii="Times New Roman" w:hAnsi="Times New Roman" w:cs="Times New Roman"/>
+          <w:sz w:val="28"/>
+          <w:szCs w:val="28"/>
+        </w:rPr>
+        <w:t xml:space="preserve">, используя функцию </w:t>
+      </w:r>
+      <w:proofErr w:type="spellStart"/>
+      <w:r>
+        <w:rPr>
+          <w:rFonts w:ascii="Times New Roman" w:hAnsi="Times New Roman" w:cs="Times New Roman"/>
+          <w:sz w:val="28"/>
+          <w:szCs w:val="28"/>
+          <w:lang w:val="en-US"/>
+        </w:rPr>
+        <w:t>LinearSolve</w:t>
+      </w:r>
+      <w:proofErr w:type="spellEnd"/>
+      <w:r>
+        <w:rPr>
+          <w:rFonts w:ascii="Times New Roman" w:hAnsi="Times New Roman" w:cs="Times New Roman"/>
+          <w:sz w:val="28"/>
+          <w:szCs w:val="28"/>
+        </w:rPr>
+        <w:t>:</w:t>
+      </w:r>
+    </w:p>
+    <w:p>
+      <w:pPr>
+        <w:pStyle w:val="a3"/>
+        <w:ind w:right="708"/>
+        <w:jc w:val="both"/>
+        <w:rPr>
+          <w:rFonts w:ascii="Times New Roman" w:hAnsi="Times New Roman" w:cs="Times New Roman"/>
+          <w:sz w:val="28"/>
+          <w:szCs w:val="28"/>
+        </w:rPr>
+      </w:pPr>
       <w:r>
         <w:rPr>
           <w:rFonts w:ascii="Times New Roman" w:hAnsi="Times New Roman" w:cs="Times New Roman"/>
@@ -1464,10 +1615,10 @@
           <w:szCs w:val="28"/>
         </w:rPr>
         <w:drawing>
-          <wp:inline distT="0" distB="0" distL="0" distR="0" wp14:anchorId="1603C9BE" wp14:editId="01B314EA">
-            <wp:extent cx="3336643" cy="2049780"/>
-            <wp:effectExtent l="0" t="0" r="0" b="7620"/>
-            <wp:docPr id="16" name="Рисунок 16"/>
+          <wp:inline distT="0" distB="0" distL="0" distR="0" wp14:anchorId="2D9A80A8" wp14:editId="20D35371">
+            <wp:extent cx="3444356" cy="1653540"/>
+            <wp:effectExtent l="0" t="0" r="3810" b="3810"/>
+            <wp:docPr id="15" name="Рисунок 15"/>
             <wp:cNvGraphicFramePr>
               <a:graphicFrameLocks xmlns:a="http://schemas.openxmlformats.org/drawingml/2006/main" noChangeAspect="1"/>
             </wp:cNvGraphicFramePr>
@@ -1487,7 +1638,7 @@
                   <pic:spPr>
                     <a:xfrm>
                       <a:off x="0" y="0"/>
-                      <a:ext cx="3342992" cy="2053680"/>
+                      <a:ext cx="3454513" cy="1658416"/>
                     </a:xfrm>
                     <a:prstGeom prst="rect">
                       <a:avLst/>
@@ -1503,14 +1654,26 @@
     <w:p>
       <w:pPr>
         <w:pStyle w:val="a3"/>
-        <w:ind w:right="708"/>
-        <w:jc w:val="both"/>
-        <w:rPr>
-          <w:rFonts w:ascii="Times New Roman" w:hAnsi="Times New Roman" w:cs="Times New Roman"/>
-          <w:sz w:val="28"/>
-          <w:szCs w:val="28"/>
-        </w:rPr>
-      </w:pPr>
+        <w:numPr>
+          <w:ilvl w:val="0"/>
+          <w:numId w:val="2"/>
+        </w:numPr>
+        <w:ind w:right="708"/>
+        <w:jc w:val="both"/>
+        <w:rPr>
+          <w:rFonts w:ascii="Times New Roman" w:hAnsi="Times New Roman" w:cs="Times New Roman"/>
+          <w:sz w:val="28"/>
+          <w:szCs w:val="28"/>
+        </w:rPr>
+      </w:pPr>
+      <w:r>
+        <w:rPr>
+          <w:rFonts w:ascii="Times New Roman" w:hAnsi="Times New Roman" w:cs="Times New Roman"/>
+          <w:sz w:val="28"/>
+          <w:szCs w:val="28"/>
+        </w:rPr>
+        <w:t>Были решены три возмущенные системы при увеличенных значениях последних уравнение системы последовательно на 0.01%, 0.1% и 1%:</w:t>
+      </w:r>
     </w:p>
     <w:p>
       <w:pPr>
@@ -1530,11 +1693,12 @@
           <w:sz w:val="28"/>
           <w:szCs w:val="28"/>
         </w:rPr>
+        <w:lastRenderedPageBreak/>
         <w:drawing>
-          <wp:inline distT="0" distB="0" distL="0" distR="0" wp14:anchorId="0E2C8494" wp14:editId="4E12F6BE">
-            <wp:extent cx="2834640" cy="1563521"/>
-            <wp:effectExtent l="0" t="0" r="3810" b="0"/>
-            <wp:docPr id="18" name="Рисунок 18"/>
+          <wp:inline distT="0" distB="0" distL="0" distR="0" wp14:anchorId="1C1FEE72" wp14:editId="02C0E3D1">
+            <wp:extent cx="3171139" cy="1844040"/>
+            <wp:effectExtent l="0" t="0" r="0" b="3810"/>
+            <wp:docPr id="17" name="Рисунок 17"/>
             <wp:cNvGraphicFramePr>
               <a:graphicFrameLocks xmlns:a="http://schemas.openxmlformats.org/drawingml/2006/main" noChangeAspect="1"/>
             </wp:cNvGraphicFramePr>
@@ -1554,7 +1718,7 @@
                   <pic:spPr>
                     <a:xfrm>
                       <a:off x="0" y="0"/>
-                      <a:ext cx="2843833" cy="1568591"/>
+                      <a:ext cx="3182619" cy="1850716"/>
                     </a:xfrm>
                     <a:prstGeom prst="rect">
                       <a:avLst/>
@@ -1566,42 +1730,6 @@
           </wp:inline>
         </w:drawing>
       </w:r>
-    </w:p>
-    <w:p>
-      <w:pPr>
-        <w:pStyle w:val="a3"/>
-        <w:numPr>
-          <w:ilvl w:val="0"/>
-          <w:numId w:val="2"/>
-        </w:numPr>
-        <w:ind w:right="708"/>
-        <w:jc w:val="both"/>
-        <w:rPr>
-          <w:rFonts w:ascii="Times New Roman" w:hAnsi="Times New Roman" w:cs="Times New Roman"/>
-          <w:sz w:val="28"/>
-          <w:szCs w:val="28"/>
-        </w:rPr>
-      </w:pPr>
-      <w:r>
-        <w:rPr>
-          <w:rFonts w:ascii="Times New Roman" w:hAnsi="Times New Roman" w:cs="Times New Roman"/>
-          <w:sz w:val="28"/>
-          <w:szCs w:val="28"/>
-        </w:rPr>
-        <w:t>Были найдены предельные относительные погрешности решения трех систем:</w:t>
-      </w:r>
-    </w:p>
-    <w:p>
-      <w:pPr>
-        <w:pStyle w:val="a3"/>
-        <w:ind w:right="708"/>
-        <w:jc w:val="both"/>
-        <w:rPr>
-          <w:rFonts w:ascii="Times New Roman" w:hAnsi="Times New Roman" w:cs="Times New Roman"/>
-          <w:sz w:val="28"/>
-          <w:szCs w:val="28"/>
-        </w:rPr>
-      </w:pPr>
       <w:r>
         <w:rPr>
           <w:rFonts w:ascii="Times New Roman" w:hAnsi="Times New Roman" w:cs="Times New Roman"/>
@@ -1609,12 +1737,11 @@
           <w:sz w:val="28"/>
           <w:szCs w:val="28"/>
         </w:rPr>
-        <w:lastRenderedPageBreak/>
         <w:drawing>
-          <wp:inline distT="0" distB="0" distL="0" distR="0" wp14:anchorId="7DC44BBC" wp14:editId="7B7E5A8D">
-            <wp:extent cx="3002280" cy="818280"/>
-            <wp:effectExtent l="0" t="0" r="7620" b="1270"/>
-            <wp:docPr id="20" name="Рисунок 20"/>
+          <wp:inline distT="0" distB="0" distL="0" distR="0" wp14:anchorId="1603C9BE" wp14:editId="01B314EA">
+            <wp:extent cx="3336643" cy="2049780"/>
+            <wp:effectExtent l="0" t="0" r="0" b="7620"/>
+            <wp:docPr id="16" name="Рисунок 16"/>
             <wp:cNvGraphicFramePr>
               <a:graphicFrameLocks xmlns:a="http://schemas.openxmlformats.org/drawingml/2006/main" noChangeAspect="1"/>
             </wp:cNvGraphicFramePr>
@@ -1634,7 +1761,7 @@
                   <pic:spPr>
                     <a:xfrm>
                       <a:off x="0" y="0"/>
-                      <a:ext cx="3018593" cy="822726"/>
+                      <a:ext cx="3342992" cy="2053680"/>
                     </a:xfrm>
                     <a:prstGeom prst="rect">
                       <a:avLst/>
@@ -1658,6 +1785,18 @@
           <w:szCs w:val="28"/>
         </w:rPr>
       </w:pPr>
+    </w:p>
+    <w:p>
+      <w:pPr>
+        <w:pStyle w:val="a3"/>
+        <w:ind w:right="708"/>
+        <w:jc w:val="both"/>
+        <w:rPr>
+          <w:rFonts w:ascii="Times New Roman" w:hAnsi="Times New Roman" w:cs="Times New Roman"/>
+          <w:sz w:val="28"/>
+          <w:szCs w:val="28"/>
+        </w:rPr>
+      </w:pPr>
       <w:r>
         <w:rPr>
           <w:rFonts w:ascii="Times New Roman" w:hAnsi="Times New Roman" w:cs="Times New Roman"/>
@@ -1666,10 +1805,10 @@
           <w:szCs w:val="28"/>
         </w:rPr>
         <w:drawing>
-          <wp:inline distT="0" distB="0" distL="0" distR="0" wp14:anchorId="65F38314" wp14:editId="10A2F6F4">
-            <wp:extent cx="2946178" cy="1691640"/>
-            <wp:effectExtent l="0" t="0" r="6985" b="3810"/>
-            <wp:docPr id="21" name="Рисунок 21"/>
+          <wp:inline distT="0" distB="0" distL="0" distR="0" wp14:anchorId="0E2C8494" wp14:editId="4E12F6BE">
+            <wp:extent cx="2834640" cy="1563521"/>
+            <wp:effectExtent l="0" t="0" r="3810" b="0"/>
+            <wp:docPr id="18" name="Рисунок 18"/>
             <wp:cNvGraphicFramePr>
               <a:graphicFrameLocks xmlns:a="http://schemas.openxmlformats.org/drawingml/2006/main" noChangeAspect="1"/>
             </wp:cNvGraphicFramePr>
@@ -1689,7 +1828,7 @@
                   <pic:spPr>
                     <a:xfrm>
                       <a:off x="0" y="0"/>
-                      <a:ext cx="2955338" cy="1696900"/>
+                      <a:ext cx="2843833" cy="1568591"/>
                     </a:xfrm>
                     <a:prstGeom prst="rect">
                       <a:avLst/>
@@ -1705,61 +1844,9 @@
     <w:p>
       <w:pPr>
         <w:pStyle w:val="a3"/>
-        <w:ind w:right="708"/>
-        <w:jc w:val="both"/>
-        <w:rPr>
-          <w:rFonts w:ascii="Times New Roman" w:hAnsi="Times New Roman" w:cs="Times New Roman"/>
-          <w:sz w:val="28"/>
-          <w:szCs w:val="28"/>
-        </w:rPr>
-      </w:pPr>
-      <w:r>
-        <w:rPr>
-          <w:rFonts w:ascii="Times New Roman" w:hAnsi="Times New Roman" w:cs="Times New Roman"/>
-          <w:sz w:val="28"/>
-          <w:szCs w:val="28"/>
-        </w:rPr>
-        <w:t xml:space="preserve">Вывод: проведенное исследование наглядно демонстрирует ключевую роль числа обусловленности матрицы и величины эквивалентных возмущений правой части в точности решения СЛАУ. </w:t>
-      </w:r>
-    </w:p>
-    <w:p>
-      <w:pPr>
-        <w:pStyle w:val="a3"/>
-        <w:ind w:right="708"/>
-        <w:jc w:val="both"/>
-        <w:rPr>
-          <w:rFonts w:ascii="Times New Roman" w:hAnsi="Times New Roman" w:cs="Times New Roman"/>
-          <w:sz w:val="28"/>
-          <w:szCs w:val="28"/>
-        </w:rPr>
-      </w:pPr>
-    </w:p>
-    <w:p>
-      <w:pPr>
-        <w:pStyle w:val="a3"/>
-        <w:ind w:right="708"/>
-        <w:jc w:val="both"/>
-        <w:rPr>
-          <w:rFonts w:ascii="Times New Roman" w:hAnsi="Times New Roman" w:cs="Times New Roman"/>
-          <w:sz w:val="28"/>
-          <w:szCs w:val="28"/>
-        </w:rPr>
-      </w:pPr>
-      <w:r>
-        <w:rPr>
-          <w:rFonts w:ascii="Times New Roman" w:hAnsi="Times New Roman" w:cs="Times New Roman"/>
-          <w:sz w:val="28"/>
-          <w:szCs w:val="28"/>
-        </w:rPr>
-        <w:t>Задание 3:</w:t>
-      </w:r>
-    </w:p>
-    <w:p>
-      <w:pPr>
-        <w:pStyle w:val="a3"/>
         <w:numPr>
           <w:ilvl w:val="0"/>
-          <w:numId w:val="3"/>
+          <w:numId w:val="2"/>
         </w:numPr>
         <w:ind w:right="708"/>
         <w:jc w:val="both"/>
@@ -1775,13 +1862,13 @@
           <w:sz w:val="28"/>
           <w:szCs w:val="28"/>
         </w:rPr>
-        <w:t>Были созданы матрицы А и В по заданным условиям:</w:t>
-      </w:r>
-    </w:p>
-    <w:p>
-      <w:pPr>
-        <w:pStyle w:val="a3"/>
-        <w:ind w:left="1080" w:right="708"/>
+        <w:t>Были найдены предельные относительные погрешности решения трех систем:</w:t>
+      </w:r>
+    </w:p>
+    <w:p>
+      <w:pPr>
+        <w:pStyle w:val="a3"/>
+        <w:ind w:right="708"/>
         <w:jc w:val="both"/>
         <w:rPr>
           <w:rFonts w:ascii="Times New Roman" w:hAnsi="Times New Roman" w:cs="Times New Roman"/>
@@ -1797,10 +1884,10 @@
           <w:szCs w:val="28"/>
         </w:rPr>
         <w:drawing>
-          <wp:inline distT="0" distB="0" distL="0" distR="0" wp14:anchorId="581F5DEB" wp14:editId="44547EF1">
-            <wp:extent cx="3938890" cy="541020"/>
-            <wp:effectExtent l="0" t="0" r="5080" b="0"/>
-            <wp:docPr id="22" name="Рисунок 22"/>
+          <wp:inline distT="0" distB="0" distL="0" distR="0" wp14:anchorId="7DC44BBC" wp14:editId="7B7E5A8D">
+            <wp:extent cx="3002280" cy="818280"/>
+            <wp:effectExtent l="0" t="0" r="7620" b="1270"/>
+            <wp:docPr id="20" name="Рисунок 20"/>
             <wp:cNvGraphicFramePr>
               <a:graphicFrameLocks xmlns:a="http://schemas.openxmlformats.org/drawingml/2006/main" noChangeAspect="1"/>
             </wp:cNvGraphicFramePr>
@@ -1820,7 +1907,7 @@
                   <pic:spPr>
                     <a:xfrm>
                       <a:off x="0" y="0"/>
-                      <a:ext cx="3954370" cy="543146"/>
+                      <a:ext cx="3018593" cy="822726"/>
                     </a:xfrm>
                     <a:prstGeom prst="rect">
                       <a:avLst/>
@@ -1836,7 +1923,7 @@
     <w:p>
       <w:pPr>
         <w:pStyle w:val="a3"/>
-        <w:ind w:left="1080" w:right="708"/>
+        <w:ind w:right="708"/>
         <w:jc w:val="both"/>
         <w:rPr>
           <w:rFonts w:ascii="Times New Roman" w:hAnsi="Times New Roman" w:cs="Times New Roman"/>
@@ -1852,10 +1939,10 @@
           <w:szCs w:val="28"/>
         </w:rPr>
         <w:drawing>
-          <wp:inline distT="0" distB="0" distL="0" distR="0" wp14:anchorId="7DABCBA1" wp14:editId="483F2AD0">
-            <wp:extent cx="3709719" cy="3672840"/>
-            <wp:effectExtent l="0" t="0" r="5080" b="3810"/>
-            <wp:docPr id="23" name="Рисунок 23"/>
+          <wp:inline distT="0" distB="0" distL="0" distR="0" wp14:anchorId="65F38314" wp14:editId="10A2F6F4">
+            <wp:extent cx="2946178" cy="1691640"/>
+            <wp:effectExtent l="0" t="0" r="6985" b="3810"/>
+            <wp:docPr id="21" name="Рисунок 21"/>
             <wp:cNvGraphicFramePr>
               <a:graphicFrameLocks xmlns:a="http://schemas.openxmlformats.org/drawingml/2006/main" noChangeAspect="1"/>
             </wp:cNvGraphicFramePr>
@@ -1875,7 +1962,7 @@
                   <pic:spPr>
                     <a:xfrm>
                       <a:off x="0" y="0"/>
-                      <a:ext cx="3711384" cy="3674488"/>
+                      <a:ext cx="2955338" cy="1696900"/>
                     </a:xfrm>
                     <a:prstGeom prst="rect">
                       <a:avLst/>
@@ -1891,6 +1978,81 @@
     <w:p>
       <w:pPr>
         <w:pStyle w:val="a3"/>
+        <w:ind w:right="708"/>
+        <w:jc w:val="both"/>
+        <w:rPr>
+          <w:rFonts w:ascii="Times New Roman" w:hAnsi="Times New Roman" w:cs="Times New Roman"/>
+          <w:sz w:val="28"/>
+          <w:szCs w:val="28"/>
+        </w:rPr>
+      </w:pPr>
+      <w:r>
+        <w:rPr>
+          <w:rFonts w:ascii="Times New Roman" w:hAnsi="Times New Roman" w:cs="Times New Roman"/>
+          <w:b/>
+          <w:bCs/>
+          <w:sz w:val="28"/>
+          <w:szCs w:val="28"/>
+        </w:rPr>
+        <w:t>Вывод:</w:t>
+      </w:r>
+      <w:r>
+        <w:rPr>
+          <w:rFonts w:ascii="Times New Roman" w:hAnsi="Times New Roman" w:cs="Times New Roman"/>
+          <w:sz w:val="28"/>
+          <w:szCs w:val="28"/>
+        </w:rPr>
+        <w:t xml:space="preserve"> проведенное исследование наглядно демонстрирует ключевую роль числа обусловленности матрицы и величины </w:t>
+      </w:r>
+      <w:r>
+        <w:rPr>
+          <w:rFonts w:ascii="Times New Roman" w:hAnsi="Times New Roman" w:cs="Times New Roman"/>
+          <w:sz w:val="28"/>
+          <w:szCs w:val="28"/>
+        </w:rPr>
+        <w:lastRenderedPageBreak/>
+        <w:t xml:space="preserve">эквивалентных возмущений правой части в точности решения СЛАУ. </w:t>
+      </w:r>
+    </w:p>
+    <w:p>
+      <w:pPr>
+        <w:pStyle w:val="a3"/>
+        <w:ind w:right="708"/>
+        <w:jc w:val="both"/>
+        <w:rPr>
+          <w:rFonts w:ascii="Times New Roman" w:hAnsi="Times New Roman" w:cs="Times New Roman"/>
+          <w:sz w:val="28"/>
+          <w:szCs w:val="28"/>
+        </w:rPr>
+      </w:pPr>
+    </w:p>
+    <w:p>
+      <w:pPr>
+        <w:pStyle w:val="a3"/>
+        <w:ind w:right="708"/>
+        <w:jc w:val="both"/>
+        <w:rPr>
+          <w:rFonts w:ascii="Times New Roman" w:hAnsi="Times New Roman" w:cs="Times New Roman"/>
+          <w:b/>
+          <w:bCs/>
+          <w:sz w:val="28"/>
+          <w:szCs w:val="28"/>
+        </w:rPr>
+      </w:pPr>
+      <w:r>
+        <w:rPr>
+          <w:rFonts w:ascii="Times New Roman" w:hAnsi="Times New Roman" w:cs="Times New Roman"/>
+          <w:b/>
+          <w:bCs/>
+          <w:sz w:val="28"/>
+          <w:szCs w:val="28"/>
+        </w:rPr>
+        <w:t>Задание 3:</w:t>
+      </w:r>
+    </w:p>
+    <w:p>
+      <w:pPr>
+        <w:pStyle w:val="a3"/>
         <w:numPr>
           <w:ilvl w:val="0"/>
           <w:numId w:val="3"/>
@@ -1909,23 +2071,7 @@
           <w:sz w:val="28"/>
           <w:szCs w:val="28"/>
         </w:rPr>
-        <w:t>Для СЛАУ примен</w:t>
-      </w:r>
-      <w:r>
-        <w:rPr>
-          <w:rFonts w:ascii="Times New Roman" w:hAnsi="Times New Roman" w:cs="Times New Roman"/>
-          <w:sz w:val="28"/>
-          <w:szCs w:val="28"/>
-        </w:rPr>
-        <w:t>им</w:t>
-      </w:r>
-      <w:r>
-        <w:rPr>
-          <w:rFonts w:ascii="Times New Roman" w:hAnsi="Times New Roman" w:cs="Times New Roman"/>
-          <w:sz w:val="28"/>
-          <w:szCs w:val="28"/>
-        </w:rPr>
-        <w:t xml:space="preserve"> метод решения Якоби:</w:t>
+        <w:t>Были созданы матрицы А и В по заданным условиям:</w:t>
       </w:r>
     </w:p>
     <w:p>
@@ -1935,42 +2081,22 @@
         <w:jc w:val="both"/>
         <w:rPr>
           <w:rFonts w:ascii="Times New Roman" w:hAnsi="Times New Roman" w:cs="Times New Roman"/>
+          <w:sz w:val="28"/>
+          <w:szCs w:val="28"/>
+        </w:rPr>
+      </w:pPr>
+      <w:r>
+        <w:rPr>
+          <w:rFonts w:ascii="Times New Roman" w:hAnsi="Times New Roman" w:cs="Times New Roman"/>
           <w:noProof/>
           <w:sz w:val="28"/>
           <w:szCs w:val="28"/>
         </w:rPr>
-      </w:pPr>
-    </w:p>
-    <w:p>
-      <w:pPr>
-        <w:pStyle w:val="a3"/>
-        <w:ind w:left="1080" w:right="708"/>
-        <w:jc w:val="both"/>
-        <w:rPr>
-          <w:rFonts w:ascii="Times New Roman" w:hAnsi="Times New Roman" w:cs="Times New Roman"/>
-          <w:noProof/>
-          <w:sz w:val="28"/>
-          <w:szCs w:val="28"/>
-        </w:rPr>
-      </w:pPr>
-    </w:p>
-    <w:p>
-      <w:pPr>
-        <w:ind w:right="708"/>
-        <w:jc w:val="both"/>
-        <w:rPr>
-          <w:rFonts w:ascii="Times New Roman" w:hAnsi="Times New Roman" w:cs="Times New Roman"/>
-          <w:sz w:val="28"/>
-          <w:szCs w:val="28"/>
-        </w:rPr>
-      </w:pPr>
-      <w:r>
-        <w:lastRenderedPageBreak/>
         <w:drawing>
-          <wp:inline distT="0" distB="0" distL="0" distR="0" wp14:anchorId="741C45E7" wp14:editId="3DD5B2FC">
-            <wp:extent cx="3542559" cy="3794760"/>
-            <wp:effectExtent l="0" t="0" r="1270" b="0"/>
-            <wp:docPr id="19" name="Рисунок 19"/>
+          <wp:inline distT="0" distB="0" distL="0" distR="0" wp14:anchorId="581F5DEB" wp14:editId="44547EF1">
+            <wp:extent cx="3938890" cy="541020"/>
+            <wp:effectExtent l="0" t="0" r="5080" b="0"/>
+            <wp:docPr id="22" name="Рисунок 22"/>
             <wp:cNvGraphicFramePr>
               <a:graphicFrameLocks xmlns:a="http://schemas.openxmlformats.org/drawingml/2006/main" noChangeAspect="1"/>
             </wp:cNvGraphicFramePr>
@@ -1990,7 +2116,7 @@
                   <pic:spPr>
                     <a:xfrm>
                       <a:off x="0" y="0"/>
-                      <a:ext cx="3547154" cy="3799682"/>
+                      <a:ext cx="3954370" cy="543146"/>
                     </a:xfrm>
                     <a:prstGeom prst="rect">
                       <a:avLst/>
@@ -2002,12 +2128,30 @@
           </wp:inline>
         </w:drawing>
       </w:r>
-      <w:r>
+    </w:p>
+    <w:p>
+      <w:pPr>
+        <w:pStyle w:val="a3"/>
+        <w:ind w:left="1080" w:right="708"/>
+        <w:jc w:val="both"/>
+        <w:rPr>
+          <w:rFonts w:ascii="Times New Roman" w:hAnsi="Times New Roman" w:cs="Times New Roman"/>
+          <w:sz w:val="28"/>
+          <w:szCs w:val="28"/>
+        </w:rPr>
+      </w:pPr>
+      <w:r>
+        <w:rPr>
+          <w:rFonts w:ascii="Times New Roman" w:hAnsi="Times New Roman" w:cs="Times New Roman"/>
+          <w:noProof/>
+          <w:sz w:val="28"/>
+          <w:szCs w:val="28"/>
+        </w:rPr>
         <w:drawing>
-          <wp:inline distT="0" distB="0" distL="0" distR="0" wp14:anchorId="748D0C8E" wp14:editId="2D0FB922">
-            <wp:extent cx="6554957" cy="812800"/>
-            <wp:effectExtent l="0" t="0" r="0" b="6350"/>
-            <wp:docPr id="27" name="Рисунок 27"/>
+          <wp:inline distT="0" distB="0" distL="0" distR="0" wp14:anchorId="7DABCBA1" wp14:editId="483F2AD0">
+            <wp:extent cx="3709719" cy="3672840"/>
+            <wp:effectExtent l="0" t="0" r="5080" b="3810"/>
+            <wp:docPr id="23" name="Рисунок 23"/>
             <wp:cNvGraphicFramePr>
               <a:graphicFrameLocks xmlns:a="http://schemas.openxmlformats.org/drawingml/2006/main" noChangeAspect="1"/>
             </wp:cNvGraphicFramePr>
@@ -2027,7 +2171,7 @@
                   <pic:spPr>
                     <a:xfrm>
                       <a:off x="0" y="0"/>
-                      <a:ext cx="6697912" cy="830526"/>
+                      <a:ext cx="3711384" cy="3674488"/>
                     </a:xfrm>
                     <a:prstGeom prst="rect">
                       <a:avLst/>
@@ -2051,39 +2195,56 @@
         <w:jc w:val="both"/>
         <w:rPr>
           <w:rFonts w:ascii="Times New Roman" w:hAnsi="Times New Roman" w:cs="Times New Roman"/>
-          <w:sz w:val="28"/>
-          <w:szCs w:val="28"/>
-        </w:rPr>
-      </w:pPr>
-      <w:r>
-        <w:rPr>
-          <w:rFonts w:ascii="Times New Roman" w:hAnsi="Times New Roman" w:cs="Times New Roman"/>
-          <w:sz w:val="28"/>
-          <w:szCs w:val="28"/>
-        </w:rPr>
-        <w:t>Для того же СЛАУ применим метод решения Зейделя:</w:t>
-      </w:r>
-    </w:p>
-    <w:p>
-      <w:pPr>
-        <w:ind w:right="708"/>
-        <w:jc w:val="both"/>
-        <w:rPr>
-          <w:rFonts w:ascii="Times New Roman" w:hAnsi="Times New Roman" w:cs="Times New Roman"/>
-          <w:sz w:val="28"/>
-          <w:szCs w:val="28"/>
-          <w:lang w:val="en-US"/>
-        </w:rPr>
-      </w:pPr>
-      <w:r>
-        <w:rPr>
-          <w:lang w:val="en-US"/>
-        </w:rPr>
+          <w:noProof/>
+          <w:sz w:val="28"/>
+          <w:szCs w:val="28"/>
+        </w:rPr>
+      </w:pPr>
+      <w:r>
+        <w:rPr>
+          <w:rFonts w:ascii="Times New Roman" w:hAnsi="Times New Roman" w:cs="Times New Roman"/>
+          <w:sz w:val="28"/>
+          <w:szCs w:val="28"/>
+        </w:rPr>
+        <w:t>Для СЛАУ примен</w:t>
+      </w:r>
+      <w:r>
+        <w:rPr>
+          <w:rFonts w:ascii="Times New Roman" w:hAnsi="Times New Roman" w:cs="Times New Roman"/>
+          <w:sz w:val="28"/>
+          <w:szCs w:val="28"/>
+        </w:rPr>
+        <w:t>им</w:t>
+      </w:r>
+      <w:r>
+        <w:rPr>
+          <w:rFonts w:ascii="Times New Roman" w:hAnsi="Times New Roman" w:cs="Times New Roman"/>
+          <w:sz w:val="28"/>
+          <w:szCs w:val="28"/>
+        </w:rPr>
+        <w:t xml:space="preserve"> метод решения Якоби:</w:t>
+      </w:r>
+    </w:p>
+    <w:p>
+      <w:pPr>
+        <w:ind w:right="708"/>
+        <w:jc w:val="both"/>
+        <w:rPr>
+          <w:rFonts w:ascii="Times New Roman" w:hAnsi="Times New Roman" w:cs="Times New Roman"/>
+          <w:sz w:val="28"/>
+          <w:szCs w:val="28"/>
+        </w:rPr>
+      </w:pPr>
+      <w:r>
+        <w:rPr>
+          <w:noProof/>
+        </w:rPr>
+        <w:lastRenderedPageBreak/>
         <w:drawing>
-          <wp:inline distT="0" distB="0" distL="0" distR="0" wp14:anchorId="5093BB63" wp14:editId="64719546">
-            <wp:extent cx="3152775" cy="3708176"/>
-            <wp:effectExtent l="0" t="0" r="0" b="6985"/>
-            <wp:docPr id="29" name="Рисунок 29"/>
+          <wp:inline distT="0" distB="0" distL="0" distR="0" wp14:anchorId="741C45E7" wp14:editId="3DD5B2FC">
+            <wp:extent cx="3542559" cy="3794760"/>
+            <wp:effectExtent l="0" t="0" r="1270" b="0"/>
+            <wp:docPr id="19" name="Рисунок 19"/>
             <wp:cNvGraphicFramePr>
               <a:graphicFrameLocks xmlns:a="http://schemas.openxmlformats.org/drawingml/2006/main" noChangeAspect="1"/>
             </wp:cNvGraphicFramePr>
@@ -2103,7 +2264,7 @@
                   <pic:spPr>
                     <a:xfrm>
                       <a:off x="0" y="0"/>
-                      <a:ext cx="3162399" cy="3719495"/>
+                      <a:ext cx="3547154" cy="3799682"/>
                     </a:xfrm>
                     <a:prstGeom prst="rect">
                       <a:avLst/>
@@ -2115,29 +2276,15 @@
           </wp:inline>
         </w:drawing>
       </w:r>
-    </w:p>
-    <w:p>
-      <w:pPr>
-        <w:ind w:right="708"/>
-        <w:jc w:val="both"/>
-        <w:rPr>
-          <w:rFonts w:ascii="Times New Roman" w:hAnsi="Times New Roman" w:cs="Times New Roman"/>
-          <w:sz w:val="28"/>
-          <w:szCs w:val="28"/>
-        </w:rPr>
-      </w:pPr>
-      <w:r>
-        <w:rPr>
-          <w:rFonts w:ascii="Times New Roman" w:hAnsi="Times New Roman" w:cs="Times New Roman"/>
-          <w:sz w:val="28"/>
-          <w:szCs w:val="28"/>
-        </w:rPr>
-        <w:lastRenderedPageBreak/>
+      <w:r>
+        <w:rPr>
+          <w:noProof/>
+        </w:rPr>
         <w:drawing>
-          <wp:inline distT="0" distB="0" distL="0" distR="0" wp14:anchorId="7611E046" wp14:editId="03203ED2">
-            <wp:extent cx="5940425" cy="793750"/>
-            <wp:effectExtent l="0" t="0" r="3175" b="6350"/>
-            <wp:docPr id="30" name="Рисунок 30"/>
+          <wp:inline distT="0" distB="0" distL="0" distR="0" wp14:anchorId="748D0C8E" wp14:editId="2D0FB922">
+            <wp:extent cx="6554957" cy="812800"/>
+            <wp:effectExtent l="0" t="0" r="0" b="6350"/>
+            <wp:docPr id="27" name="Рисунок 27"/>
             <wp:cNvGraphicFramePr>
               <a:graphicFrameLocks xmlns:a="http://schemas.openxmlformats.org/drawingml/2006/main" noChangeAspect="1"/>
             </wp:cNvGraphicFramePr>
@@ -2157,6 +2304,138 @@
                   <pic:spPr>
                     <a:xfrm>
                       <a:off x="0" y="0"/>
+                      <a:ext cx="6697912" cy="830526"/>
+                    </a:xfrm>
+                    <a:prstGeom prst="rect">
+                      <a:avLst/>
+                    </a:prstGeom>
+                  </pic:spPr>
+                </pic:pic>
+              </a:graphicData>
+            </a:graphic>
+          </wp:inline>
+        </w:drawing>
+      </w:r>
+    </w:p>
+    <w:p>
+      <w:pPr>
+        <w:pStyle w:val="a3"/>
+        <w:numPr>
+          <w:ilvl w:val="0"/>
+          <w:numId w:val="3"/>
+        </w:numPr>
+        <w:ind w:right="708"/>
+        <w:jc w:val="both"/>
+        <w:rPr>
+          <w:rFonts w:ascii="Times New Roman" w:hAnsi="Times New Roman" w:cs="Times New Roman"/>
+          <w:sz w:val="28"/>
+          <w:szCs w:val="28"/>
+        </w:rPr>
+      </w:pPr>
+      <w:r>
+        <w:rPr>
+          <w:rFonts w:ascii="Times New Roman" w:hAnsi="Times New Roman" w:cs="Times New Roman"/>
+          <w:sz w:val="28"/>
+          <w:szCs w:val="28"/>
+        </w:rPr>
+        <w:t>Для того же СЛАУ применим метод решения Зейделя:</w:t>
+      </w:r>
+    </w:p>
+    <w:p>
+      <w:pPr>
+        <w:ind w:right="708"/>
+        <w:jc w:val="both"/>
+        <w:rPr>
+          <w:rFonts w:ascii="Times New Roman" w:hAnsi="Times New Roman" w:cs="Times New Roman"/>
+          <w:sz w:val="28"/>
+          <w:szCs w:val="28"/>
+          <w:lang w:val="en-US"/>
+        </w:rPr>
+      </w:pPr>
+      <w:r>
+        <w:rPr>
+          <w:noProof/>
+          <w:lang w:val="en-US"/>
+        </w:rPr>
+        <w:drawing>
+          <wp:inline distT="0" distB="0" distL="0" distR="0" wp14:anchorId="5093BB63" wp14:editId="64719546">
+            <wp:extent cx="3152775" cy="3708176"/>
+            <wp:effectExtent l="0" t="0" r="0" b="6985"/>
+            <wp:docPr id="29" name="Рисунок 29"/>
+            <wp:cNvGraphicFramePr>
+              <a:graphicFrameLocks xmlns:a="http://schemas.openxmlformats.org/drawingml/2006/main" noChangeAspect="1"/>
+            </wp:cNvGraphicFramePr>
+            <a:graphic xmlns:a="http://schemas.openxmlformats.org/drawingml/2006/main">
+              <a:graphicData uri="http://schemas.openxmlformats.org/drawingml/2006/picture">
+                <pic:pic xmlns:pic="http://schemas.openxmlformats.org/drawingml/2006/picture">
+                  <pic:nvPicPr>
+                    <pic:cNvPr id="1" name=""/>
+                    <pic:cNvPicPr/>
+                  </pic:nvPicPr>
+                  <pic:blipFill>
+                    <a:blip r:embed="rId31"/>
+                    <a:stretch>
+                      <a:fillRect/>
+                    </a:stretch>
+                  </pic:blipFill>
+                  <pic:spPr>
+                    <a:xfrm>
+                      <a:off x="0" y="0"/>
+                      <a:ext cx="3162399" cy="3719495"/>
+                    </a:xfrm>
+                    <a:prstGeom prst="rect">
+                      <a:avLst/>
+                    </a:prstGeom>
+                  </pic:spPr>
+                </pic:pic>
+              </a:graphicData>
+            </a:graphic>
+          </wp:inline>
+        </w:drawing>
+      </w:r>
+    </w:p>
+    <w:p>
+      <w:pPr>
+        <w:ind w:right="708"/>
+        <w:jc w:val="both"/>
+        <w:rPr>
+          <w:rFonts w:ascii="Times New Roman" w:hAnsi="Times New Roman" w:cs="Times New Roman"/>
+          <w:sz w:val="28"/>
+          <w:szCs w:val="28"/>
+        </w:rPr>
+      </w:pPr>
+      <w:r>
+        <w:rPr>
+          <w:rFonts w:ascii="Times New Roman" w:hAnsi="Times New Roman" w:cs="Times New Roman"/>
+          <w:noProof/>
+          <w:sz w:val="28"/>
+          <w:szCs w:val="28"/>
+        </w:rPr>
+        <w:lastRenderedPageBreak/>
+        <w:drawing>
+          <wp:inline distT="0" distB="0" distL="0" distR="0" wp14:anchorId="7611E046" wp14:editId="03203ED2">
+            <wp:extent cx="5940425" cy="793750"/>
+            <wp:effectExtent l="0" t="0" r="3175" b="6350"/>
+            <wp:docPr id="30" name="Рисунок 30"/>
+            <wp:cNvGraphicFramePr>
+              <a:graphicFrameLocks xmlns:a="http://schemas.openxmlformats.org/drawingml/2006/main" noChangeAspect="1"/>
+            </wp:cNvGraphicFramePr>
+            <a:graphic xmlns:a="http://schemas.openxmlformats.org/drawingml/2006/main">
+              <a:graphicData uri="http://schemas.openxmlformats.org/drawingml/2006/picture">
+                <pic:pic xmlns:pic="http://schemas.openxmlformats.org/drawingml/2006/picture">
+                  <pic:nvPicPr>
+                    <pic:cNvPr id="1" name=""/>
+                    <pic:cNvPicPr/>
+                  </pic:nvPicPr>
+                  <pic:blipFill>
+                    <a:blip r:embed="rId32"/>
+                    <a:stretch>
+                      <a:fillRect/>
+                    </a:stretch>
+                  </pic:blipFill>
+                  <pic:spPr>
+                    <a:xfrm>
+                      <a:off x="0" y="0"/>
                       <a:ext cx="5940425" cy="793750"/>
                     </a:xfrm>
                     <a:prstGeom prst="rect">
@@ -2211,10 +2490,20 @@
       <w:r>
         <w:rPr>
           <w:rFonts w:ascii="Times New Roman" w:hAnsi="Times New Roman" w:cs="Times New Roman"/>
-          <w:sz w:val="28"/>
-          <w:szCs w:val="28"/>
-        </w:rPr>
-        <w:t xml:space="preserve">Вывод: </w:t>
+          <w:b/>
+          <w:bCs/>
+          <w:sz w:val="28"/>
+          <w:szCs w:val="28"/>
+        </w:rPr>
+        <w:t>Вывод:</w:t>
+      </w:r>
+      <w:r>
+        <w:rPr>
+          <w:rFonts w:ascii="Times New Roman" w:hAnsi="Times New Roman" w:cs="Times New Roman"/>
+          <w:sz w:val="28"/>
+          <w:szCs w:val="28"/>
+        </w:rPr>
+        <w:t xml:space="preserve"> </w:t>
       </w:r>
       <w:r>
         <w:rPr>
@@ -2241,8 +2530,6 @@
       <w:r>
         <w:rPr>
           <w:rStyle w:val="a4"/>
-          <w:b w:val="0"/>
-          <w:bCs w:val="0"/>
           <w:color w:val="0F1115"/>
           <w:sz w:val="28"/>
           <w:szCs w:val="28"/>

</xml_diff>